<commit_message>
Added SBOM.json, updated raport
</commit_message>
<xml_diff>
--- a/docs/raport.docx
+++ b/docs/raport.docx
@@ -21,51 +21,6 @@
         <w:spacing w:before="240" w:after="120"/>
         <w:rPr>
           <w:rFonts w:ascii="Liberation Sans" w:hAnsi="Liberation Sans"/>
-        </w:rPr>
-      </w:pPr>
-      <w:r>
-        <w:rPr>
-          <w:rFonts w:ascii="Liberation Sans" w:hAnsi="Liberation Sans"/>
-        </w:rPr>
-        <w:t>Participant: Gabriel Drozbik</w:t>
-      </w:r>
-    </w:p>
-    <w:p>
-      <w:pPr>
-        <w:pStyle w:val="BodyText"/>
-        <w:bidi w:val="0"/>
-        <w:spacing w:before="240" w:after="120"/>
-        <w:rPr>
-          <w:rFonts w:ascii="Liberation Sans" w:hAnsi="Liberation Sans"/>
-        </w:rPr>
-      </w:pPr>
-      <w:r>
-        <w:rPr>
-          <w:rFonts w:ascii="Liberation Sans" w:hAnsi="Liberation Sans"/>
-        </w:rPr>
-        <w:t>Candidate number: 8011</w:t>
-      </w:r>
-    </w:p>
-    <w:p>
-      <w:pPr>
-        <w:pStyle w:val="BodyText"/>
-        <w:bidi w:val="0"/>
-        <w:spacing w:before="240" w:after="120"/>
-        <w:rPr/>
-      </w:pPr>
-      <w:r>
-        <w:rPr/>
-      </w:r>
-    </w:p>
-    <w:p>
-      <w:pPr>
-        <w:pStyle w:val="Normal"/>
-        <w:bidi w:val="0"/>
-        <w:jc w:val="left"/>
-        <w:rPr>
-          <w:rFonts w:ascii="DejaVu Sans" w:hAnsi="DejaVu Sans"/>
-          <w:sz w:val="36"/>
-          <w:szCs w:val="36"/>
         </w:rPr>
       </w:pPr>
       <w:r>
@@ -2664,81 +2619,106 @@
           <w:sz w:val="24"/>
           <w:szCs w:val="24"/>
         </w:rPr>
-        <w:t>A lot of libraries were utilised in this project, but generally, most have been used for 1-2 features. Before I list them all, I used the Node Package Manager (NPM). A package manager is a program that simplifies software installation (especially in the form of dependency management) and management (e.g. deletion).</w:t>
-      </w:r>
-    </w:p>
-    <w:p>
-      <w:pPr>
-        <w:pStyle w:val="BodyText"/>
-        <w:bidi w:val="0"/>
-        <w:spacing w:before="0" w:after="140"/>
-        <w:jc w:val="left"/>
-        <w:rPr>
-          <w:rFonts w:ascii="Liberation Sans" w:hAnsi="Liberation Sans"/>
-          <w:b w:val="false"/>
-          <w:bCs w:val="false"/>
-          <w:sz w:val="24"/>
-          <w:szCs w:val="24"/>
-        </w:rPr>
-      </w:pPr>
-      <w:r>
-        <w:rPr>
-          <w:rFonts w:ascii="Liberation Sans" w:hAnsi="Liberation Sans"/>
-          <w:b w:val="false"/>
-          <w:bCs w:val="false"/>
-          <w:sz w:val="24"/>
-          <w:szCs w:val="24"/>
-        </w:rPr>
-      </w:r>
-    </w:p>
-    <w:p>
-      <w:pPr>
-        <w:pStyle w:val="BodyText"/>
-        <w:bidi w:val="0"/>
-        <w:spacing w:before="0" w:after="140"/>
-        <w:jc w:val="left"/>
-        <w:rPr>
-          <w:rFonts w:ascii="Liberation Sans" w:hAnsi="Liberation Sans"/>
-          <w:b w:val="false"/>
-          <w:bCs w:val="false"/>
-          <w:sz w:val="24"/>
-          <w:szCs w:val="24"/>
-        </w:rPr>
-      </w:pPr>
-      <w:r>
-        <w:rPr>
-          <w:rFonts w:ascii="Liberation Sans" w:hAnsi="Liberation Sans"/>
-          <w:b w:val="false"/>
-          <w:bCs w:val="false"/>
-          <w:sz w:val="24"/>
-          <w:szCs w:val="24"/>
-        </w:rPr>
-        <w:t>Dependencies (to run the website):</w:t>
-      </w:r>
-    </w:p>
-    <w:p>
-      <w:pPr>
-        <w:pStyle w:val="BodyText"/>
-        <w:bidi w:val="0"/>
-        <w:spacing w:before="0" w:after="140"/>
-        <w:jc w:val="left"/>
-        <w:rPr>
-          <w:rFonts w:ascii="Liberation Sans" w:hAnsi="Liberation Sans"/>
-          <w:b w:val="false"/>
-          <w:bCs w:val="false"/>
-          <w:sz w:val="24"/>
-          <w:szCs w:val="24"/>
-        </w:rPr>
-      </w:pPr>
-      <w:r>
-        <w:rPr>
-          <w:rFonts w:ascii="Liberation Sans" w:hAnsi="Liberation Sans"/>
-          <w:b w:val="false"/>
-          <w:bCs w:val="false"/>
-          <w:sz w:val="24"/>
-          <w:szCs w:val="24"/>
-        </w:rPr>
-        <w:t>typescript: The language used itself, package (library) for transpiling,</w:t>
+        <w:t>A lot of libraries were utilised in this project, but generally, most have been used for 1-2 features. Before I list them, I used the Node Package Manager (NPM). A package manager is a program that simplifies software installation (especially in the form of dependency management) and management (e.g. deletion).</w:t>
+      </w:r>
+    </w:p>
+    <w:p>
+      <w:pPr>
+        <w:pStyle w:val="BodyText"/>
+        <w:bidi w:val="0"/>
+        <w:spacing w:before="0" w:after="140"/>
+        <w:jc w:val="left"/>
+        <w:rPr>
+          <w:rFonts w:ascii="Liberation Sans" w:hAnsi="Liberation Sans"/>
+          <w:b w:val="false"/>
+          <w:bCs w:val="false"/>
+          <w:sz w:val="24"/>
+          <w:szCs w:val="24"/>
+        </w:rPr>
+      </w:pPr>
+      <w:r>
+        <w:rPr>
+          <w:rFonts w:ascii="Liberation Sans" w:hAnsi="Liberation Sans"/>
+          <w:b w:val="false"/>
+          <w:bCs w:val="false"/>
+          <w:sz w:val="24"/>
+          <w:szCs w:val="24"/>
+        </w:rPr>
+        <w:t>An important note is that the bellow isn’t the complete curation of all libraries used. A lot are dependencies and NodeJS modules (the standard library), even if they haven’t been used.</w:t>
+      </w:r>
+    </w:p>
+    <w:p>
+      <w:pPr>
+        <w:pStyle w:val="BodyText"/>
+        <w:bidi w:val="0"/>
+        <w:spacing w:before="0" w:after="140"/>
+        <w:jc w:val="left"/>
+        <w:rPr>
+          <w:rFonts w:ascii="Liberation Sans" w:hAnsi="Liberation Sans"/>
+          <w:b w:val="false"/>
+          <w:bCs w:val="false"/>
+          <w:sz w:val="24"/>
+          <w:szCs w:val="24"/>
+        </w:rPr>
+      </w:pPr>
+      <w:r>
+        <w:rPr>
+          <w:rFonts w:ascii="Liberation Sans" w:hAnsi="Liberation Sans"/>
+          <w:b w:val="false"/>
+          <w:bCs w:val="false"/>
+          <w:sz w:val="24"/>
+          <w:szCs w:val="24"/>
+        </w:rPr>
+      </w:r>
+    </w:p>
+    <w:p>
+      <w:pPr>
+        <w:pStyle w:val="BodyText"/>
+        <w:bidi w:val="0"/>
+        <w:spacing w:before="0" w:after="140"/>
+        <w:jc w:val="left"/>
+        <w:rPr>
+          <w:rFonts w:ascii="Liberation Sans" w:hAnsi="Liberation Sans"/>
+          <w:b w:val="false"/>
+          <w:bCs w:val="false"/>
+          <w:sz w:val="24"/>
+          <w:szCs w:val="24"/>
+        </w:rPr>
+      </w:pPr>
+      <w:r>
+        <w:rPr>
+          <w:rFonts w:ascii="Liberation Sans" w:hAnsi="Liberation Sans"/>
+          <w:b w:val="false"/>
+          <w:bCs w:val="false"/>
+          <w:sz w:val="24"/>
+          <w:szCs w:val="24"/>
+        </w:rPr>
+        <w:t>Library packages to run the website:</w:t>
+      </w:r>
+    </w:p>
+    <w:p>
+      <w:pPr>
+        <w:pStyle w:val="BodyText"/>
+        <w:bidi w:val="0"/>
+        <w:spacing w:before="0" w:after="140"/>
+        <w:jc w:val="left"/>
+        <w:rPr>
+          <w:rFonts w:ascii="Liberation Sans" w:hAnsi="Liberation Sans"/>
+          <w:b w:val="false"/>
+          <w:bCs w:val="false"/>
+          <w:sz w:val="24"/>
+          <w:szCs w:val="24"/>
+        </w:rPr>
+      </w:pPr>
+      <w:r>
+        <w:rPr>
+          <w:rFonts w:ascii="Liberation Sans" w:hAnsi="Liberation Sans"/>
+          <w:b w:val="false"/>
+          <w:bCs w:val="false"/>
+          <w:sz w:val="24"/>
+          <w:szCs w:val="24"/>
+        </w:rPr>
+        <w:t>typescript: The language used in the project, package (library) for transpiling,</w:t>
       </w:r>
     </w:p>
     <w:p>
@@ -2938,7 +2918,7 @@
           <w:sz w:val="24"/>
           <w:szCs w:val="24"/>
         </w:rPr>
-        <w:t>Development dependencies; pre-made types for some of the packages above:</w:t>
+        <w:t>Development packages; pre-made types for some of the packages above:</w:t>
       </w:r>
     </w:p>
     <w:p>
@@ -5848,6 +5828,55 @@
           <w:szCs w:val="24"/>
         </w:rPr>
         <w:t>14 directories, 62 files</w:t>
+      </w:r>
+    </w:p>
+    <w:p>
+      <w:pPr>
+        <w:pStyle w:val="BodyText"/>
+        <w:bidi w:val="0"/>
+        <w:spacing w:before="0" w:after="140"/>
+        <w:jc w:val="left"/>
+        <w:rPr>
+          <w:rFonts w:ascii="Liberation Sans" w:hAnsi="Liberation Sans"/>
+          <w:b w:val="false"/>
+          <w:bCs w:val="false"/>
+          <w:sz w:val="24"/>
+          <w:szCs w:val="24"/>
+        </w:rPr>
+      </w:pPr>
+      <w:r>
+        <w:rPr>
+          <w:rFonts w:ascii="Liberation Sans" w:hAnsi="Liberation Sans"/>
+          <w:b w:val="false"/>
+          <w:bCs w:val="false"/>
+          <w:sz w:val="24"/>
+          <w:szCs w:val="24"/>
+        </w:rPr>
+      </w:r>
+    </w:p>
+    <w:p>
+      <w:pPr>
+        <w:pStyle w:val="BodyText"/>
+        <w:bidi w:val="0"/>
+        <w:spacing w:before="0" w:after="140"/>
+        <w:jc w:val="left"/>
+        <w:rPr>
+          <w:rFonts w:ascii="Liberation Sans" w:hAnsi="Liberation Sans"/>
+          <w:b w:val="false"/>
+          <w:bCs w:val="false"/>
+          <w:sz w:val="24"/>
+          <w:szCs w:val="24"/>
+        </w:rPr>
+      </w:pPr>
+      <w:r>
+        <w:rPr>
+          <w:rFonts w:ascii="Liberation Sans" w:hAnsi="Liberation Sans"/>
+          <w:b w:val="false"/>
+          <w:bCs w:val="false"/>
+          <w:sz w:val="24"/>
+          <w:szCs w:val="24"/>
+        </w:rPr>
+        <w:t xml:space="preserve">Note that before I ran that I command I removed all compiled code as well as the node_modules directory. The reason being is that </w:t>
       </w:r>
     </w:p>
     <w:p>

</xml_diff>

<commit_message>
Updated+organised auxiliary files, included hierarchy in raport
</commit_message>
<xml_diff>
--- a/docs/raport.docx
+++ b/docs/raport.docx
@@ -1579,24 +1579,58 @@
         </w:rPr>
       </w:pPr>
       <w:r>
-        <w:rPr>
-          <w:rFonts w:ascii="Liberation Sans" w:hAnsi="Liberation Sans"/>
-        </w:rPr>
-      </w:r>
-    </w:p>
-    <w:p>
-      <w:pPr>
-        <w:pStyle w:val="BodyText"/>
-        <w:bidi w:val="0"/>
-        <w:jc w:val="left"/>
-        <w:rPr>
-          <w:rFonts w:ascii="Liberation Sans" w:hAnsi="Liberation Sans"/>
-        </w:rPr>
-      </w:pPr>
-      <w:r>
-        <w:rPr>
-          <w:rFonts w:ascii="Liberation Sans" w:hAnsi="Liberation Sans"/>
-        </w:rPr>
+        <w:drawing>
+          <wp:anchor distT="0" distB="0" distL="0" distR="0" simplePos="0" relativeHeight="2" behindDoc="0" locked="0" layoutInCell="0" allowOverlap="1">
+            <wp:simplePos x="0" y="0"/>
+            <wp:positionH relativeFrom="column">
+              <wp:posOffset>-164465</wp:posOffset>
+            </wp:positionH>
+            <wp:positionV relativeFrom="paragraph">
+              <wp:posOffset>472440</wp:posOffset>
+            </wp:positionV>
+            <wp:extent cx="6120130" cy="8655685"/>
+            <wp:effectExtent l="0" t="0" r="0" b="0"/>
+            <wp:wrapSquare wrapText="largest"/>
+            <wp:docPr id="1" name="Image1"/>
+            <wp:cNvGraphicFramePr>
+              <a:graphicFrameLocks xmlns:a="http://schemas.openxmlformats.org/drawingml/2006/main" noChangeAspect="1"/>
+            </wp:cNvGraphicFramePr>
+            <a:graphic xmlns:a="http://schemas.openxmlformats.org/drawingml/2006/main">
+              <a:graphicData uri="http://schemas.openxmlformats.org/drawingml/2006/picture">
+                <pic:pic xmlns:pic="http://schemas.openxmlformats.org/drawingml/2006/picture">
+                  <pic:nvPicPr>
+                    <pic:cNvPr id="1" name="Image1"/>
+                    <pic:cNvPicPr>
+                      <a:picLocks noChangeAspect="1" noChangeArrowheads="1"/>
+                    </pic:cNvPicPr>
+                  </pic:nvPicPr>
+                  <pic:blipFill>
+                    <a:blip r:embed="rId2"/>
+                    <a:stretch>
+                      <a:fillRect/>
+                    </a:stretch>
+                  </pic:blipFill>
+                  <pic:spPr bwMode="auto">
+                    <a:xfrm>
+                      <a:off x="0" y="0"/>
+                      <a:ext cx="6120130" cy="8655685"/>
+                    </a:xfrm>
+                    <a:prstGeom prst="rect">
+                      <a:avLst/>
+                    </a:prstGeom>
+                    <a:noFill/>
+                  </pic:spPr>
+                </pic:pic>
+              </a:graphicData>
+            </a:graphic>
+          </wp:anchor>
+        </w:drawing>
+      </w:r>
+      <w:r>
+        <w:rPr>
+          <w:rFonts w:ascii="Liberation Sans" w:hAnsi="Liberation Sans"/>
+        </w:rPr>
+        <w:t>The hierarchy below displays all navigable pages, which are all GET endpoints.</w:t>
       </w:r>
     </w:p>
     <w:p>
@@ -2644,7 +2678,17 @@
           <w:sz w:val="24"/>
           <w:szCs w:val="24"/>
         </w:rPr>
-        <w:t>An important note is that the bellow isn’t the complete curation of all libraries used. A lot are dependencies and NodeJS modules (the standard library), even if they haven’t been used.</w:t>
+        <w:t xml:space="preserve">An important note is that the bellow isn’t the complete curation of libraries used. A lot are dependencies and NodeJS modules (the standard library), even if they haven’t been used. </w:t>
+      </w:r>
+      <w:r>
+        <w:rPr>
+          <w:rFonts w:ascii="Liberation Sans" w:hAnsi="Liberation Sans"/>
+          <w:b w:val="false"/>
+          <w:bCs w:val="false"/>
+          <w:sz w:val="24"/>
+          <w:szCs w:val="24"/>
+        </w:rPr>
+        <w:t>The project includes</w:t>
       </w:r>
     </w:p>
     <w:p>
@@ -2743,7 +2787,47 @@
           <w:sz w:val="24"/>
           <w:szCs w:val="24"/>
         </w:rPr>
-        <w:t>express: The web framework used, most notable uses are HTTP routing and helpers,</w:t>
+        <w:t xml:space="preserve">express: The web framework used, </w:t>
+      </w:r>
+      <w:r>
+        <w:rPr>
+          <w:rFonts w:ascii="Liberation Sans" w:hAnsi="Liberation Sans"/>
+          <w:b w:val="false"/>
+          <w:bCs w:val="false"/>
+          <w:sz w:val="24"/>
+          <w:szCs w:val="24"/>
+        </w:rPr>
+        <w:t xml:space="preserve">used for </w:t>
+      </w:r>
+      <w:r>
+        <w:rPr>
+          <w:rFonts w:ascii="Liberation Sans" w:hAnsi="Liberation Sans"/>
+          <w:b w:val="false"/>
+          <w:bCs w:val="false"/>
+          <w:sz w:val="24"/>
+          <w:szCs w:val="24"/>
+        </w:rPr>
+        <w:t xml:space="preserve">HTTP routing and helpers </w:t>
+      </w:r>
+      <w:r>
+        <w:rPr>
+          <w:rFonts w:ascii="Liberation Sans" w:hAnsi="Liberation Sans"/>
+          <w:b w:val="false"/>
+          <w:bCs w:val="false"/>
+          <w:sz w:val="24"/>
+          <w:szCs w:val="24"/>
+        </w:rPr>
+        <w:t>(e.g. redirecting)</w:t>
+      </w:r>
+      <w:r>
+        <w:rPr>
+          <w:rFonts w:ascii="Liberation Sans" w:hAnsi="Liberation Sans"/>
+          <w:b w:val="false"/>
+          <w:bCs w:val="false"/>
+          <w:sz w:val="24"/>
+          <w:szCs w:val="24"/>
+        </w:rPr>
+        <w:t>,</w:t>
       </w:r>
     </w:p>
     <w:p>
@@ -6002,9 +6086,9 @@
       </w:r>
     </w:p>
     <w:sectPr>
-      <w:footerReference w:type="even" r:id="rId2"/>
-      <w:footerReference w:type="default" r:id="rId3"/>
-      <w:footerReference w:type="first" r:id="rId4"/>
+      <w:footerReference w:type="even" r:id="rId3"/>
+      <w:footerReference w:type="default" r:id="rId4"/>
+      <w:footerReference w:type="first" r:id="rId5"/>
       <w:type w:val="nextPage"/>
       <w:pgSz w:w="11906" w:h="16838"/>
       <w:pgMar w:left="1134" w:right="1134" w:gutter="0" w:header="0" w:top="1134" w:footer="1134" w:bottom="1693"/>
@@ -6052,7 +6136,7 @@
     </w:r>
     <w:r>
       <w:rPr/>
-      <w:t>11</w:t>
+      <w:t>5</w:t>
     </w:r>
     <w:r>
       <w:rPr/>
@@ -6083,7 +6167,7 @@
     </w:r>
     <w:r>
       <w:rPr/>
-      <w:t>11</w:t>
+      <w:t>5</w:t>
     </w:r>
     <w:r>
       <w:rPr/>

</xml_diff>